<commit_message>
fix(docs): justify body text and render legal-entity requisites in generated documents
</commit_message>
<xml_diff>
--- a/apps/web/src/server/templates/assembly_service_contract_2026.docx
+++ b/apps/web/src/server/templates/assembly_service_contract_2026.docx
@@ -74,11 +74,13 @@
     <w:p>
       <w:pPr>
         <w:spacing w:after="40" w:before="0"/>
+        <w:jc w:val="both"/>
       </w:pPr>
     </w:p>
     <w:p>
       <w:pPr>
         <w:spacing w:after="120" w:before="0"/>
+        <w:jc w:val="both"/>
       </w:pPr>
       <w:r>
         <w:rPr>
@@ -88,12 +90,13 @@
           <w:sz w:val="24"/>
           <w:u w:val="none"/>
         </w:rPr>
-        <w:t>Общество с ограниченной ответственностью «Про Мебель» (далее — ООО «Про Мебель»), именуемое в дальнейшем «Исполнитель», в лице генерального директора Батьковского Юрия Сергеевича, действующего на основании Устава, с одной стороны, и {{Client.fullName}}, именуемый(ая) в дальнейшем «Заказчик», с другой стороны, совместно именуемые «Стороны», заключили настоящий Договор (далее — «Договор») о нижеследующем.</w:t>
+        <w:t>Общество с ограниченной ответственностью «Про Мебель» (далее — ООО «Про Мебель»), именуемое в дальнейшем «Исполнитель», в лице генерального директора Батьковского Юрия Сергеевича, действующего на основании Устава, с одной стороны, и {{Client.fullName}}, {{Client.named}} в дальнейшем «Заказчик», с другой стороны, совместно именуемые «Стороны», заключили настоящий Договор (далее — «Договор») о нижеследующем.</w:t>
       </w:r>
     </w:p>
     <w:p>
       <w:pPr>
         <w:spacing w:after="80" w:before="160"/>
+        <w:jc w:val="both"/>
       </w:pPr>
       <w:r>
         <w:rPr>
@@ -109,6 +112,7 @@
     <w:p>
       <w:pPr>
         <w:spacing w:after="120" w:before="0"/>
+        <w:jc w:val="both"/>
       </w:pPr>
       <w:r>
         <w:rPr>
@@ -124,6 +128,7 @@
     <w:p>
       <w:pPr>
         <w:spacing w:after="120" w:before="0"/>
+        <w:jc w:val="both"/>
       </w:pPr>
       <w:r>
         <w:rPr>
@@ -139,6 +144,7 @@
     <w:p>
       <w:pPr>
         <w:spacing w:after="120" w:before="0"/>
+        <w:jc w:val="both"/>
       </w:pPr>
       <w:r>
         <w:rPr>
@@ -154,6 +160,7 @@
     <w:p>
       <w:pPr>
         <w:spacing w:after="80" w:before="160"/>
+        <w:jc w:val="both"/>
       </w:pPr>
       <w:r>
         <w:rPr>
@@ -169,6 +176,7 @@
     <w:p>
       <w:pPr>
         <w:spacing w:after="120" w:before="0"/>
+        <w:jc w:val="both"/>
       </w:pPr>
       <w:r>
         <w:rPr>
@@ -184,6 +192,7 @@
     <w:p>
       <w:pPr>
         <w:spacing w:after="120" w:before="0"/>
+        <w:jc w:val="both"/>
       </w:pPr>
       <w:r>
         <w:rPr>
@@ -199,6 +208,7 @@
     <w:p>
       <w:pPr>
         <w:spacing w:after="80" w:before="160"/>
+        <w:jc w:val="both"/>
       </w:pPr>
       <w:r>
         <w:rPr>
@@ -214,6 +224,7 @@
     <w:p>
       <w:pPr>
         <w:spacing w:after="120" w:before="0"/>
+        <w:jc w:val="both"/>
       </w:pPr>
       <w:r>
         <w:rPr>
@@ -230,6 +241,7 @@
       <w:pPr>
         <w:spacing w:after="120" w:before="0"/>
         <w:ind w:left="340"/>
+        <w:jc w:val="both"/>
       </w:pPr>
       <w:r>
         <w:rPr>
@@ -246,6 +258,7 @@
       <w:pPr>
         <w:spacing w:after="120" w:before="0"/>
         <w:ind w:left="340"/>
+        <w:jc w:val="both"/>
       </w:pPr>
       <w:r>
         <w:rPr>
@@ -262,6 +275,7 @@
       <w:pPr>
         <w:spacing w:after="120" w:before="0"/>
         <w:ind w:left="340"/>
+        <w:jc w:val="both"/>
       </w:pPr>
       <w:r>
         <w:rPr>
@@ -277,6 +291,7 @@
     <w:p>
       <w:pPr>
         <w:spacing w:after="120" w:before="0"/>
+        <w:jc w:val="both"/>
       </w:pPr>
       <w:r>
         <w:rPr>
@@ -293,6 +308,7 @@
       <w:pPr>
         <w:spacing w:after="120" w:before="0"/>
         <w:ind w:left="340"/>
+        <w:jc w:val="both"/>
       </w:pPr>
       <w:r>
         <w:rPr>
@@ -309,6 +325,7 @@
       <w:pPr>
         <w:spacing w:after="120" w:before="0"/>
         <w:ind w:left="340"/>
+        <w:jc w:val="both"/>
       </w:pPr>
       <w:r>
         <w:rPr>
@@ -325,6 +342,7 @@
       <w:pPr>
         <w:spacing w:after="120" w:before="0"/>
         <w:ind w:left="340"/>
+        <w:jc w:val="both"/>
       </w:pPr>
       <w:r>
         <w:rPr>
@@ -341,6 +359,7 @@
       <w:pPr>
         <w:spacing w:after="120" w:before="0"/>
         <w:ind w:left="340"/>
+        <w:jc w:val="both"/>
       </w:pPr>
       <w:r>
         <w:rPr>
@@ -357,6 +376,7 @@
       <w:pPr>
         <w:spacing w:after="120" w:before="0"/>
         <w:ind w:left="340"/>
+        <w:jc w:val="both"/>
       </w:pPr>
       <w:r>
         <w:rPr>
@@ -372,6 +392,7 @@
     <w:p>
       <w:pPr>
         <w:spacing w:after="120" w:before="0"/>
+        <w:jc w:val="both"/>
       </w:pPr>
       <w:r>
         <w:rPr>
@@ -387,6 +408,7 @@
     <w:p>
       <w:pPr>
         <w:spacing w:after="80" w:before="160"/>
+        <w:jc w:val="both"/>
       </w:pPr>
       <w:r>
         <w:rPr>
@@ -402,6 +424,7 @@
     <w:p>
       <w:pPr>
         <w:spacing w:after="120" w:before="0"/>
+        <w:jc w:val="both"/>
       </w:pPr>
       <w:r>
         <w:rPr>
@@ -417,6 +440,7 @@
     <w:p>
       <w:pPr>
         <w:spacing w:after="120" w:before="0"/>
+        <w:jc w:val="both"/>
       </w:pPr>
       <w:r>
         <w:rPr>
@@ -432,6 +456,7 @@
     <w:p>
       <w:pPr>
         <w:spacing w:after="120" w:before="0"/>
+        <w:jc w:val="both"/>
       </w:pPr>
       <w:r>
         <w:rPr>
@@ -447,6 +472,7 @@
     <w:p>
       <w:pPr>
         <w:spacing w:after="120" w:before="0"/>
+        <w:jc w:val="both"/>
       </w:pPr>
       <w:r>
         <w:rPr>
@@ -462,6 +488,7 @@
     <w:p>
       <w:pPr>
         <w:spacing w:after="80" w:before="160"/>
+        <w:jc w:val="both"/>
       </w:pPr>
       <w:r>
         <w:rPr>
@@ -477,6 +504,7 @@
     <w:p>
       <w:pPr>
         <w:spacing w:after="120" w:before="0"/>
+        <w:jc w:val="both"/>
       </w:pPr>
       <w:r>
         <w:rPr>
@@ -492,6 +520,7 @@
     <w:p>
       <w:pPr>
         <w:spacing w:after="120" w:before="0"/>
+        <w:jc w:val="both"/>
       </w:pPr>
       <w:r>
         <w:rPr>
@@ -507,6 +536,7 @@
     <w:p>
       <w:pPr>
         <w:spacing w:after="120" w:before="0"/>
+        <w:jc w:val="both"/>
       </w:pPr>
       <w:r>
         <w:rPr>
@@ -522,6 +552,7 @@
     <w:p>
       <w:pPr>
         <w:spacing w:after="120" w:before="0"/>
+        <w:jc w:val="both"/>
       </w:pPr>
       <w:r>
         <w:rPr>
@@ -537,6 +568,7 @@
     <w:p>
       <w:pPr>
         <w:spacing w:after="120" w:before="0"/>
+        <w:jc w:val="both"/>
       </w:pPr>
       <w:r>
         <w:rPr>
@@ -552,6 +584,7 @@
     <w:p>
       <w:pPr>
         <w:spacing w:after="120" w:before="0"/>
+        <w:jc w:val="both"/>
       </w:pPr>
       <w:r>
         <w:rPr>
@@ -567,6 +600,7 @@
     <w:p>
       <w:pPr>
         <w:spacing w:after="80" w:before="160"/>
+        <w:jc w:val="both"/>
       </w:pPr>
       <w:r>
         <w:rPr>
@@ -582,6 +616,7 @@
     <w:p>
       <w:pPr>
         <w:spacing w:after="120" w:before="0"/>
+        <w:jc w:val="both"/>
       </w:pPr>
       <w:r>
         <w:rPr>
@@ -597,6 +632,7 @@
     <w:p>
       <w:pPr>
         <w:spacing w:after="120" w:before="0"/>
+        <w:jc w:val="both"/>
       </w:pPr>
       <w:r>
         <w:rPr>
@@ -612,6 +648,7 @@
     <w:p>
       <w:pPr>
         <w:spacing w:after="120" w:before="0"/>
+        <w:jc w:val="both"/>
       </w:pPr>
       <w:r>
         <w:rPr>
@@ -627,6 +664,7 @@
     <w:p>
       <w:pPr>
         <w:spacing w:after="80" w:before="160"/>
+        <w:jc w:val="both"/>
       </w:pPr>
       <w:r>
         <w:rPr>
@@ -642,6 +680,7 @@
     <w:p>
       <w:pPr>
         <w:spacing w:after="120" w:before="0"/>
+        <w:jc w:val="both"/>
       </w:pPr>
       <w:r>
         <w:rPr>
@@ -657,6 +696,7 @@
     <w:p>
       <w:pPr>
         <w:spacing w:after="120" w:before="0"/>
+        <w:jc w:val="both"/>
       </w:pPr>
       <w:r>
         <w:rPr>
@@ -672,6 +712,7 @@
     <w:p>
       <w:pPr>
         <w:spacing w:after="80" w:before="160"/>
+        <w:jc w:val="both"/>
       </w:pPr>
       <w:r>
         <w:rPr>
@@ -895,7 +936,7 @@
               <w:spacing w:after="40"/>
             </w:pPr>
             <w:r>
-              <w:t>Ф.И.О.: {{Client.fullName}}</w:t>
+              <w:t>{{Client.reqLine1}}</w:t>
             </w:r>
             <w:r>
               <w:rPr>
@@ -919,7 +960,7 @@
                 <w:sz w:val="22"/>
                 <w:u w:val="none"/>
               </w:rPr>
-              <w:t>Паспорт: серия {{Client.passport.series}} № {{Client.passport.number}}</w:t>
+              <w:t>{{Client.reqLine2}}</w:t>
             </w:r>
           </w:p>
           <w:p>
@@ -934,7 +975,7 @@
                 <w:sz w:val="22"/>
                 <w:u w:val="none"/>
               </w:rPr>
-              <w:t>Выдан: {{Client.passport.issuedBy}}</w:t>
+              <w:t>{{Client.reqLine3}}</w:t>
             </w:r>
           </w:p>
           <w:p>
@@ -949,7 +990,7 @@
                 <w:sz w:val="22"/>
                 <w:u w:val="none"/>
               </w:rPr>
-              <w:t>Дата выдачи: {{Client.passport.issuedAt}} Код подразделения: {{Client.passport.code}}</w:t>
+              <w:t>{{Client.reqLine4}}</w:t>
             </w:r>
           </w:p>
           <w:p>
@@ -964,7 +1005,7 @@
                 <w:sz w:val="22"/>
                 <w:u w:val="none"/>
               </w:rPr>
-              <w:t>Адрес: {{Client.regAddress}}</w:t>
+              <w:t>{{Client.reqLine5}}</w:t>
             </w:r>
           </w:p>
           <w:p>
@@ -979,7 +1020,7 @@
                 <w:sz w:val="22"/>
                 <w:u w:val="none"/>
               </w:rPr>
-              <w:t>Тел.: {{Client.phone}}</w:t>
+              <w:t>{{Client.reqLine6}}</w:t>
             </w:r>
           </w:p>
         </w:tc>

</xml_diff>